<commit_message>
feat: update smartlab management flows
</commit_message>
<xml_diff>
--- a/智能实验室系统数据库结构说明.docx
+++ b/智能实验室系统数据库结构说明.docx
@@ -15709,7 +15709,20 @@
                 <w:vertAlign w:val="baseline"/>
                 <w:lang w:val="en-US" w:eastAsia="zh-CN" w:bidi="ar-SA"/>
               </w:rPr>
-              <w:t>前辈组件ID（如果是更换后的，指向原组件）</w:t>
+              <w:t>前辈组件ID（如果该组件是更换后的，该字段指向原组件ID</w:t>
+            </w:r>
+            <w:bookmarkStart w:id="0" w:name="_GoBack"/>
+            <w:bookmarkEnd w:id="0"/>
+            <w:r>
+              <w:rPr>
+                <w:rFonts w:hint="eastAsia" w:cstheme="minorBidi"/>
+                <w:kern w:val="2"/>
+                <w:sz w:val="21"/>
+                <w:szCs w:val="24"/>
+                <w:vertAlign w:val="baseline"/>
+                <w:lang w:val="en-US" w:eastAsia="zh-CN" w:bidi="ar-SA"/>
+              </w:rPr>
+              <w:t>）</w:t>
             </w:r>
           </w:p>
         </w:tc>
@@ -16092,12 +16105,6 @@
             <w:insideH w:val="single" w:color="auto" w:sz="4" w:space="0"/>
             <w:insideV w:val="single" w:color="auto" w:sz="4" w:space="0"/>
           </w:tblBorders>
-          <w:tblCellMar>
-            <w:top w:w="0" w:type="dxa"/>
-            <w:left w:w="108" w:type="dxa"/>
-            <w:bottom w:w="0" w:type="dxa"/>
-            <w:right w:w="108" w:type="dxa"/>
-          </w:tblCellMar>
         </w:tblPrEx>
         <w:tc>
           <w:tcPr>
@@ -23580,12 +23587,6 @@
             <w:insideH w:val="single" w:color="auto" w:sz="4" w:space="0"/>
             <w:insideV w:val="single" w:color="auto" w:sz="4" w:space="0"/>
           </w:tblBorders>
-          <w:tblCellMar>
-            <w:top w:w="0" w:type="dxa"/>
-            <w:left w:w="108" w:type="dxa"/>
-            <w:bottom w:w="0" w:type="dxa"/>
-            <w:right w:w="108" w:type="dxa"/>
-          </w:tblCellMar>
         </w:tblPrEx>
         <w:tc>
           <w:tcPr>
@@ -32706,12 +32707,6 @@
             <w:insideH w:val="single" w:color="auto" w:sz="4" w:space="0"/>
             <w:insideV w:val="single" w:color="auto" w:sz="4" w:space="0"/>
           </w:tblBorders>
-          <w:tblCellMar>
-            <w:top w:w="0" w:type="dxa"/>
-            <w:left w:w="108" w:type="dxa"/>
-            <w:bottom w:w="0" w:type="dxa"/>
-            <w:right w:w="108" w:type="dxa"/>
-          </w:tblCellMar>
         </w:tblPrEx>
         <w:tc>
           <w:tcPr>
@@ -33894,12 +33889,6 @@
             <w:insideH w:val="single" w:color="auto" w:sz="4" w:space="0"/>
             <w:insideV w:val="single" w:color="auto" w:sz="4" w:space="0"/>
           </w:tblBorders>
-          <w:tblCellMar>
-            <w:top w:w="0" w:type="dxa"/>
-            <w:left w:w="108" w:type="dxa"/>
-            <w:bottom w:w="0" w:type="dxa"/>
-            <w:right w:w="108" w:type="dxa"/>
-          </w:tblCellMar>
         </w:tblPrEx>
         <w:tc>
           <w:tcPr>
@@ -42212,8 +42201,6 @@
         </w:rPr>
         <w:t>3.2违规记录表</w:t>
       </w:r>
-      <w:bookmarkStart w:id="0" w:name="_GoBack"/>
-      <w:bookmarkEnd w:id="0"/>
     </w:p>
     <w:tbl>
       <w:tblPr>

</xml_diff>